<commit_message>
Replicate sir's Paper 7 run
</commit_message>
<xml_diff>
--- a/topic7/paper/Paper07_Clinic_Overbooking_Exploration.docx
+++ b/topic7/paper/Paper07_Clinic_Overbooking_Exploration.docx
@@ -2392,7 +2392,7 @@
       <w:r>
         <w:drawing>
           <wp:inline xmlns:a="http://schemas.openxmlformats.org/drawingml/2006/main" xmlns:pic="http://schemas.openxmlformats.org/drawingml/2006/picture">
-            <wp:extent cx="2520000" cy="1801839"/>
+            <wp:extent cx="2520000" cy="1756286"/>
             <wp:docPr id="1" name="Picture 1"/>
             <wp:cNvGraphicFramePr>
               <a:graphicFrameLocks noChangeAspect="1"/>
@@ -2413,7 +2413,7 @@
                   <pic:spPr>
                     <a:xfrm>
                       <a:off x="0" y="0"/>
-                      <a:ext cx="2520000" cy="1801839"/>
+                      <a:ext cx="2520000" cy="1756286"/>
                     </a:xfrm>
                     <a:prstGeom prst="rect"/>
                   </pic:spPr>
@@ -2476,7 +2476,7 @@
       <w:r>
         <w:drawing>
           <wp:inline xmlns:a="http://schemas.openxmlformats.org/drawingml/2006/main" xmlns:pic="http://schemas.openxmlformats.org/drawingml/2006/picture">
-            <wp:extent cx="3240000" cy="2007362"/>
+            <wp:extent cx="3240000" cy="1947700"/>
             <wp:docPr id="2" name="Picture 2"/>
             <wp:cNvGraphicFramePr>
               <a:graphicFrameLocks noChangeAspect="1"/>
@@ -2497,7 +2497,7 @@
                   <pic:spPr>
                     <a:xfrm>
                       <a:off x="0" y="0"/>
-                      <a:ext cx="3240000" cy="2007362"/>
+                      <a:ext cx="3240000" cy="1947700"/>
                     </a:xfrm>
                     <a:prstGeom prst="rect"/>
                   </pic:spPr>
@@ -3311,7 +3311,7 @@
       <w:r>
         <w:drawing>
           <wp:inline xmlns:a="http://schemas.openxmlformats.org/drawingml/2006/main" xmlns:pic="http://schemas.openxmlformats.org/drawingml/2006/picture">
-            <wp:extent cx="3960000" cy="2012739"/>
+            <wp:extent cx="3960000" cy="2153286"/>
             <wp:docPr id="3" name="Picture 3"/>
             <wp:cNvGraphicFramePr>
               <a:graphicFrameLocks noChangeAspect="1"/>
@@ -3332,7 +3332,7 @@
                   <pic:spPr>
                     <a:xfrm>
                       <a:off x="0" y="0"/>
-                      <a:ext cx="3960000" cy="2012739"/>
+                      <a:ext cx="3960000" cy="2153286"/>
                     </a:xfrm>
                     <a:prstGeom prst="rect"/>
                   </pic:spPr>
@@ -4741,7 +4741,7 @@
       <w:r>
         <w:drawing>
           <wp:inline xmlns:a="http://schemas.openxmlformats.org/drawingml/2006/main" xmlns:pic="http://schemas.openxmlformats.org/drawingml/2006/picture">
-            <wp:extent cx="2520000" cy="1547089"/>
+            <wp:extent cx="2520000" cy="1532181"/>
             <wp:docPr id="4" name="Picture 4"/>
             <wp:cNvGraphicFramePr>
               <a:graphicFrameLocks noChangeAspect="1"/>
@@ -4762,7 +4762,7 @@
                   <pic:spPr>
                     <a:xfrm>
                       <a:off x="0" y="0"/>
-                      <a:ext cx="2520000" cy="1547089"/>
+                      <a:ext cx="2520000" cy="1532181"/>
                     </a:xfrm>
                     <a:prstGeom prst="rect"/>
                   </pic:spPr>
@@ -33466,223 +33466,10 @@
 <b:Sources xmlns:b="http://schemas.openxmlformats.org/officeDocument/2006/bibliography" xmlns="http://schemas.openxmlformats.org/officeDocument/2006/bibliography" SelectedStyle="/APA.XSL" StyleName="APA"/>
 </file>
 
-<file path=customXml/item2.xml><?xml version="1.0" encoding="utf-8"?>
-<ct:contentTypeSchema xmlns:ct="http://schemas.microsoft.com/office/2006/metadata/contentType" xmlns:ma="http://schemas.microsoft.com/office/2006/metadata/properties/metaAttributes" ct:_="" ma:_="" ma:contentTypeName="Document" ma:contentTypeID="0x010100E0DC7E5EA801DF4ABA861A90BD78DEFB" ma:contentTypeVersion="9" ma:contentTypeDescription="Create a new document." ma:contentTypeScope="" ma:versionID="8b50664f8f51867cca263c41a1b76f51">
-  <xsd:schema xmlns:xsd="http://www.w3.org/2001/XMLSchema" xmlns:xs="http://www.w3.org/2001/XMLSchema" xmlns:p="http://schemas.microsoft.com/office/2006/metadata/properties" xmlns:ns2="06517b02-e7b2-4e03-aef0-b8946278022a" xmlns:ns3="2e93f98a-b6a9-4ae0-9293-d4df402f6f55" targetNamespace="http://schemas.microsoft.com/office/2006/metadata/properties" ma:root="true" ma:fieldsID="9d4d40ae0f2bdf88ad445d5266456b1d" ns2:_="" ns3:_="">
-    <xsd:import namespace="06517b02-e7b2-4e03-aef0-b8946278022a"/>
-    <xsd:import namespace="2e93f98a-b6a9-4ae0-9293-d4df402f6f55"/>
-    <xsd:element name="properties">
-      <xsd:complexType>
-        <xsd:sequence>
-          <xsd:element name="documentManagement">
-            <xsd:complexType>
-              <xsd:all>
-                <xsd:element ref="ns2:MediaServiceMetadata" minOccurs="0"/>
-                <xsd:element ref="ns2:MediaServiceFastMetadata" minOccurs="0"/>
-                <xsd:element ref="ns2:MediaServiceSearchProperties" minOccurs="0"/>
-                <xsd:element ref="ns2:MediaServiceDateTaken" minOccurs="0"/>
-                <xsd:element ref="ns2:lcf76f155ced4ddcb4097134ff3c332f" minOccurs="0"/>
-                <xsd:element ref="ns3:TaxCatchAll" minOccurs="0"/>
-                <xsd:element ref="ns2:MediaServiceGenerationTime" minOccurs="0"/>
-                <xsd:element ref="ns2:MediaServiceEventHashCode" minOccurs="0"/>
-              </xsd:all>
-            </xsd:complexType>
-          </xsd:element>
-        </xsd:sequence>
-      </xsd:complexType>
-    </xsd:element>
-  </xsd:schema>
-  <xsd:schema xmlns:xsd="http://www.w3.org/2001/XMLSchema" xmlns:xs="http://www.w3.org/2001/XMLSchema" xmlns:dms="http://schemas.microsoft.com/office/2006/documentManagement/types" xmlns:pc="http://schemas.microsoft.com/office/infopath/2007/PartnerControls" targetNamespace="06517b02-e7b2-4e03-aef0-b8946278022a" elementFormDefault="qualified">
-    <xsd:import namespace="http://schemas.microsoft.com/office/2006/documentManagement/types"/>
-    <xsd:import namespace="http://schemas.microsoft.com/office/infopath/2007/PartnerControls"/>
-    <xsd:element name="MediaServiceMetadata" ma:index="8" nillable="true" ma:displayName="MediaServiceMetadata" ma:hidden="true" ma:internalName="MediaServiceMetadata" ma:readOnly="true">
-      <xsd:simpleType>
-        <xsd:restriction base="dms:Note"/>
-      </xsd:simpleType>
-    </xsd:element>
-    <xsd:element name="MediaServiceFastMetadata" ma:index="9" nillable="true" ma:displayName="MediaServiceFastMetadata" ma:hidden="true" ma:internalName="MediaServiceFastMetadata" ma:readOnly="true">
-      <xsd:simpleType>
-        <xsd:restriction base="dms:Note"/>
-      </xsd:simpleType>
-    </xsd:element>
-    <xsd:element name="MediaServiceSearchProperties" ma:index="10" nillable="true" ma:displayName="MediaServiceSearchProperties" ma:hidden="true" ma:internalName="MediaServiceSearchProperties" ma:readOnly="true">
-      <xsd:simpleType>
-        <xsd:restriction base="dms:Note"/>
-      </xsd:simpleType>
-    </xsd:element>
-    <xsd:element name="MediaServiceDateTaken" ma:index="11" nillable="true" ma:displayName="MediaServiceDateTaken" ma:hidden="true" ma:indexed="true" ma:internalName="MediaServiceDateTaken" ma:readOnly="true">
-      <xsd:simpleType>
-        <xsd:restriction base="dms:Text"/>
-      </xsd:simpleType>
-    </xsd:element>
-    <xsd:element name="lcf76f155ced4ddcb4097134ff3c332f" ma:index="13" nillable="true" ma:taxonomy="true" ma:internalName="lcf76f155ced4ddcb4097134ff3c332f" ma:taxonomyFieldName="MediaServiceImageTags" ma:displayName="Image Tags" ma:readOnly="false" ma:fieldId="{5cf76f15-5ced-4ddc-b409-7134ff3c332f}" ma:taxonomyMulti="true" ma:sspId="d34f2db7-5c9e-4885-aa5f-8b428826e263" ma:termSetId="09814cd3-568e-fe90-9814-8d621ff8fb84" ma:anchorId="fba54fb3-c3e1-fe81-a776-ca4b69148c4d" ma:open="true" ma:isKeyword="false">
-      <xsd:complexType>
-        <xsd:sequence>
-          <xsd:element ref="pc:Terms" minOccurs="0" maxOccurs="1"/>
-        </xsd:sequence>
-      </xsd:complexType>
-    </xsd:element>
-    <xsd:element name="MediaServiceGenerationTime" ma:index="15" nillable="true" ma:displayName="MediaServiceGenerationTime" ma:hidden="true" ma:internalName="MediaServiceGenerationTime" ma:readOnly="true">
-      <xsd:simpleType>
-        <xsd:restriction base="dms:Text"/>
-      </xsd:simpleType>
-    </xsd:element>
-    <xsd:element name="MediaServiceEventHashCode" ma:index="16" nillable="true" ma:displayName="MediaServiceEventHashCode" ma:hidden="true" ma:internalName="MediaServiceEventHashCode" ma:readOnly="true">
-      <xsd:simpleType>
-        <xsd:restriction base="dms:Text"/>
-      </xsd:simpleType>
-    </xsd:element>
-  </xsd:schema>
-  <xsd:schema xmlns:xsd="http://www.w3.org/2001/XMLSchema" xmlns:xs="http://www.w3.org/2001/XMLSchema" xmlns:dms="http://schemas.microsoft.com/office/2006/documentManagement/types" xmlns:pc="http://schemas.microsoft.com/office/infopath/2007/PartnerControls" targetNamespace="2e93f98a-b6a9-4ae0-9293-d4df402f6f55" elementFormDefault="qualified">
-    <xsd:import namespace="http://schemas.microsoft.com/office/2006/documentManagement/types"/>
-    <xsd:import namespace="http://schemas.microsoft.com/office/infopath/2007/PartnerControls"/>
-    <xsd:element name="TaxCatchAll" ma:index="14" nillable="true" ma:displayName="Taxonomy Catch All Column" ma:hidden="true" ma:list="{280a918b-8d08-49a0-a9f4-6ce0f93c3f4a}" ma:internalName="TaxCatchAll" ma:showField="CatchAllData" ma:web="2e93f98a-b6a9-4ae0-9293-d4df402f6f55">
-      <xsd:complexType>
-        <xsd:complexContent>
-          <xsd:extension base="dms:MultiChoiceLookup">
-            <xsd:sequence>
-              <xsd:element name="Value" type="dms:Lookup" maxOccurs="unbounded" minOccurs="0" nillable="true"/>
-            </xsd:sequence>
-          </xsd:extension>
-        </xsd:complexContent>
-      </xsd:complexType>
-    </xsd:element>
-  </xsd:schema>
-  <xsd:schema xmlns="http://schemas.openxmlformats.org/package/2006/metadata/core-properties" xmlns:xsd="http://www.w3.org/2001/XMLSchema" xmlns:xsi="http://www.w3.org/2001/XMLSchema-instance" xmlns:dc="http://purl.org/dc/elements/1.1/" xmlns:dcterms="http://purl.org/dc/terms/" xmlns:odoc="http://schemas.microsoft.com/internal/obd" targetNamespace="http://schemas.openxmlformats.org/package/2006/metadata/core-properties" elementFormDefault="qualified" attributeFormDefault="unqualified" blockDefault="#all">
-    <xsd:import namespace="http://purl.org/dc/elements/1.1/" schemaLocation="http://dublincore.org/schemas/xmls/qdc/2003/04/02/dc.xsd"/>
-    <xsd:import namespace="http://purl.org/dc/terms/" schemaLocation="http://dublincore.org/schemas/xmls/qdc/2003/04/02/dcterms.xsd"/>
-    <xsd:element name="coreProperties" type="CT_coreProperties"/>
-    <xsd:complexType name="CT_coreProperties">
-      <xsd:all>
-        <xsd:element ref="dc:creator" minOccurs="0" maxOccurs="1"/>
-        <xsd:element ref="dcterms:created" minOccurs="0" maxOccurs="1"/>
-        <xsd:element ref="dc:identifier" minOccurs="0" maxOccurs="1"/>
-        <xsd:element name="contentType" minOccurs="0" maxOccurs="1" type="xsd:string" ma:index="0" ma:displayName="Content Type"/>
-        <xsd:element ref="dc:title" minOccurs="0" maxOccurs="1" ma:index="4" ma:displayName="Title"/>
-        <xsd:element ref="dc:subject" minOccurs="0" maxOccurs="1"/>
-        <xsd:element ref="dc:description" minOccurs="0" maxOccurs="1"/>
-        <xsd:element name="keywords" minOccurs="0" maxOccurs="1" type="xsd:string"/>
-        <xsd:element ref="dc:language" minOccurs="0" maxOccurs="1"/>
-        <xsd:element name="category" minOccurs="0" maxOccurs="1" type="xsd:string"/>
-        <xsd:element name="version" minOccurs="0" maxOccurs="1" type="xsd:string"/>
-        <xsd:element name="revision" minOccurs="0" maxOccurs="1" type="xsd:string">
-          <xsd:annotation>
-            <xsd:documentation>
-                        This value indicates the number of saves or revisions. The application is responsible for updating this value after each revision.
-                    </xsd:documentation>
-          </xsd:annotation>
-        </xsd:element>
-        <xsd:element name="lastModifiedBy" minOccurs="0" maxOccurs="1" type="xsd:string"/>
-        <xsd:element ref="dcterms:modified" minOccurs="0" maxOccurs="1"/>
-        <xsd:element name="contentStatus" minOccurs="0" maxOccurs="1" type="xsd:string"/>
-      </xsd:all>
-    </xsd:complexType>
-  </xsd:schema>
-  <xs:schema xmlns:pc="http://schemas.microsoft.com/office/infopath/2007/PartnerControls" xmlns:xs="http://www.w3.org/2001/XMLSchema" targetNamespace="http://schemas.microsoft.com/office/infopath/2007/PartnerControls" elementFormDefault="qualified" attributeFormDefault="unqualified">
-    <xs:element name="Person">
-      <xs:complexType>
-        <xs:sequence>
-          <xs:element ref="pc:DisplayName" minOccurs="0"/>
-          <xs:element ref="pc:AccountId" minOccurs="0"/>
-          <xs:element ref="pc:AccountType" minOccurs="0"/>
-        </xs:sequence>
-      </xs:complexType>
-    </xs:element>
-    <xs:element name="DisplayName" type="xs:string"/>
-    <xs:element name="AccountId" type="xs:string"/>
-    <xs:element name="AccountType" type="xs:string"/>
-    <xs:element name="BDCAssociatedEntity">
-      <xs:complexType>
-        <xs:sequence>
-          <xs:element ref="pc:BDCEntity" minOccurs="0" maxOccurs="unbounded"/>
-        </xs:sequence>
-        <xs:attribute ref="pc:EntityNamespace"/>
-        <xs:attribute ref="pc:EntityName"/>
-        <xs:attribute ref="pc:SystemInstanceName"/>
-        <xs:attribute ref="pc:AssociationName"/>
-      </xs:complexType>
-    </xs:element>
-    <xs:attribute name="EntityNamespace" type="xs:string"/>
-    <xs:attribute name="EntityName" type="xs:string"/>
-    <xs:attribute name="SystemInstanceName" type="xs:string"/>
-    <xs:attribute name="AssociationName" type="xs:string"/>
-    <xs:element name="BDCEntity">
-      <xs:complexType>
-        <xs:sequence>
-          <xs:element ref="pc:EntityDisplayName" minOccurs="0"/>
-          <xs:element ref="pc:EntityInstanceReference" minOccurs="0"/>
-          <xs:element ref="pc:EntityId1" minOccurs="0"/>
-          <xs:element ref="pc:EntityId2" minOccurs="0"/>
-          <xs:element ref="pc:EntityId3" minOccurs="0"/>
-          <xs:element ref="pc:EntityId4" minOccurs="0"/>
-          <xs:element ref="pc:EntityId5" minOccurs="0"/>
-        </xs:sequence>
-      </xs:complexType>
-    </xs:element>
-    <xs:element name="EntityDisplayName" type="xs:string"/>
-    <xs:element name="EntityInstanceReference" type="xs:string"/>
-    <xs:element name="EntityId1" type="xs:string"/>
-    <xs:element name="EntityId2" type="xs:string"/>
-    <xs:element name="EntityId3" type="xs:string"/>
-    <xs:element name="EntityId4" type="xs:string"/>
-    <xs:element name="EntityId5" type="xs:string"/>
-    <xs:element name="Terms">
-      <xs:complexType>
-        <xs:sequence>
-          <xs:element ref="pc:TermInfo" minOccurs="0" maxOccurs="unbounded"/>
-        </xs:sequence>
-      </xs:complexType>
-    </xs:element>
-    <xs:element name="TermInfo">
-      <xs:complexType>
-        <xs:sequence>
-          <xs:element ref="pc:TermName" minOccurs="0"/>
-          <xs:element ref="pc:TermId" minOccurs="0"/>
-        </xs:sequence>
-      </xs:complexType>
-    </xs:element>
-    <xs:element name="TermName" type="xs:string"/>
-    <xs:element name="TermId" type="xs:string"/>
-  </xs:schema>
-</ct:contentTypeSchema>
-</file>
-
-<file path=customXml/item3.xml><?xml version="1.0" encoding="utf-8"?>
-<?mso-contentType ?>
-<FormTemplates xmlns="http://schemas.microsoft.com/sharepoint/v3/contenttype/forms">
-  <Display>DocumentLibraryForm</Display>
-  <Edit>DocumentLibraryForm</Edit>
-  <New>DocumentLibraryForm</New>
-</FormTemplates>
-</file>
-
-<file path=customXml/item4.xml><?xml version="1.0" encoding="utf-8"?>
-<p:properties xmlns:p="http://schemas.microsoft.com/office/2006/metadata/properties" xmlns:xsi="http://www.w3.org/2001/XMLSchema-instance" xmlns:pc="http://schemas.microsoft.com/office/infopath/2007/PartnerControls">
-  <documentManagement>
-    <lcf76f155ced4ddcb4097134ff3c332f xmlns="06517b02-e7b2-4e03-aef0-b8946278022a">
-      <Terms xmlns="http://schemas.microsoft.com/office/infopath/2007/PartnerControls"/>
-    </lcf76f155ced4ddcb4097134ff3c332f>
-    <TaxCatchAll xmlns="2e93f98a-b6a9-4ae0-9293-d4df402f6f55" xsi:nil="true"/>
-  </documentManagement>
-</p:properties>
-</file>
-
 <file path=customXml/itemProps1.xml><?xml version="1.0" encoding="utf-8"?>
 <ds:datastoreItem xmlns:ds="http://schemas.openxmlformats.org/officeDocument/2006/customXml" ds:itemID="{EF278816-EC6F-A645-907D-7F25AECB1D4A}">
   <ds:schemaRefs>
     <ds:schemaRef ds:uri="http://schemas.openxmlformats.org/officeDocument/2006/bibliography"/>
   </ds:schemaRefs>
 </ds:datastoreItem>
-</file>
-
-<file path=customXml/itemProps2.xml><?xml version="1.0" encoding="utf-8"?>
-<ds:datastoreItem xmlns:ds="http://schemas.openxmlformats.org/officeDocument/2006/customXml" ds:itemID="{0B0DC236-192F-40D3-BF70-FC3F531A25C9}"/>
-</file>
-
-<file path=customXml/itemProps3.xml><?xml version="1.0" encoding="utf-8"?>
-<ds:datastoreItem xmlns:ds="http://schemas.openxmlformats.org/officeDocument/2006/customXml" ds:itemID="{3986353E-307B-46AA-B6BF-939422704F54}"/>
-</file>
-
-<file path=customXml/itemProps4.xml><?xml version="1.0" encoding="utf-8"?>
-<ds:datastoreItem xmlns:ds="http://schemas.openxmlformats.org/officeDocument/2006/customXml" ds:itemID="{A448C6DC-11A6-448A-92BE-2DFA9FD2F9E5}"/>
 </file>
</xml_diff>